<commit_message>
Add multi-mechanism missingness stress test
</commit_message>
<xml_diff>
--- a/manuscript/ProjectA_BaoCao_Draft_Audited.docx
+++ b/manuscript/ProjectA_BaoCao_Draft_Audited.docx
@@ -1651,7 +1651,7 @@
           <wp:inline distT="0" distB="0" distL="0" distR="0">
             <wp:extent cx="4000500" cy="2524125"/>
             <wp:effectExtent t="0" r="0" b="0" l="0"/>
-            <wp:docPr id="1" name="" descr="" title=""/>
+            <wp:docPr id="1" name="" descr="Image: 9de0101959f2a3914168244c6eb4f1acb3709ee8.png" title=""/>
             <wp:cNvGraphicFramePr>
               <a:graphicFrameLocks xmlns:a="http://schemas.openxmlformats.org/drawingml/2006/main" noChangeAspect="1"/>
             </wp:cNvGraphicFramePr>
@@ -1721,7 +1721,7 @@
           <wp:inline distT="0" distB="0" distL="0" distR="0">
             <wp:extent cx="5334000" cy="1714500"/>
             <wp:effectExtent t="0" r="0" b="0" l="0"/>
-            <wp:docPr id="1" name="" descr="" title=""/>
+            <wp:docPr id="1" name="" descr="Image: 412eeab46f30f603f6f59c0508c2628714381e9e.png" title=""/>
             <wp:cNvGraphicFramePr>
               <a:graphicFrameLocks xmlns:a="http://schemas.openxmlformats.org/drawingml/2006/main" noChangeAspect="1"/>
             </wp:cNvGraphicFramePr>
@@ -1782,7 +1782,7 @@
           <wp:inline distT="0" distB="0" distL="0" distR="0">
             <wp:extent cx="5334000" cy="3657600"/>
             <wp:effectExtent t="0" r="0" b="0" l="0"/>
-            <wp:docPr id="1" name="" descr="" title=""/>
+            <wp:docPr id="1" name="" descr="Image: 52efa39a1feb410de8e074fc591ab65342318d67.png" title=""/>
             <wp:cNvGraphicFramePr>
               <a:graphicFrameLocks xmlns:a="http://schemas.openxmlformats.org/drawingml/2006/main" noChangeAspect="1"/>
             </wp:cNvGraphicFramePr>
@@ -3208,7 +3208,7 @@
           <wp:inline distT="0" distB="0" distL="0" distR="0">
             <wp:extent cx="4572000" cy="3657600"/>
             <wp:effectExtent t="0" r="0" b="0" l="0"/>
-            <wp:docPr id="1" name="" descr="" title=""/>
+            <wp:docPr id="1" name="" descr="Image: fa7957826331c222e48bbf8d0e0a4e85ef655a70.png" title=""/>
             <wp:cNvGraphicFramePr>
               <a:graphicFrameLocks xmlns:a="http://schemas.openxmlformats.org/drawingml/2006/main" noChangeAspect="1"/>
             </wp:cNvGraphicFramePr>
@@ -4584,7 +4584,7 @@
           <wp:inline distT="0" distB="0" distL="0" distR="0">
             <wp:extent cx="4572000" cy="2752725"/>
             <wp:effectExtent t="0" r="0" b="0" l="0"/>
-            <wp:docPr id="1" name="" descr="" title=""/>
+            <wp:docPr id="1" name="" descr="Image: 679bf15acd8845ff991aef053b9f3ceac1c1f32d.png" title=""/>
             <wp:cNvGraphicFramePr>
               <a:graphicFrameLocks xmlns:a="http://schemas.openxmlformats.org/drawingml/2006/main" noChangeAspect="1"/>
             </wp:cNvGraphicFramePr>
@@ -4669,7 +4669,7 @@
           <wp:inline distT="0" distB="0" distL="0" distR="0">
             <wp:extent cx="4000500" cy="5143500"/>
             <wp:effectExtent t="0" r="0" b="0" l="0"/>
-            <wp:docPr id="1" name="" descr="" title=""/>
+            <wp:docPr id="1" name="" descr="Image: 2e4865917ac6f96f0f922660a875e5ecf7a80305.png" title=""/>
             <wp:cNvGraphicFramePr>
               <a:graphicFrameLocks xmlns:a="http://schemas.openxmlformats.org/drawingml/2006/main" noChangeAspect="1"/>
             </wp:cNvGraphicFramePr>
@@ -5076,7 +5076,870 @@
         <w:spacing w:after="120" w:before="280"/>
       </w:pPr>
       <w:r>
-        <w:t xml:space="preserve">5.13 Hiệu năng hệ thống</w:t>
+        <w:t xml:space="preserve">5.13 Stress test đa cơ chế missingness</w:t>
+      </w:r>
+    </w:p>
+    <w:p>
+      <w:pPr>
+        <w:spacing w:after="160" w:line="300"/>
+        <w:jc w:val="both"/>
+      </w:pPr>
+      <w:r>
+        <w:rPr>
+          <w:b w:val="false"/>
+          <w:bCs w:val="false"/>
+          <w:i w:val="false"/>
+          <w:iCs w:val="false"/>
+        </w:rPr>
+        <w:t xml:space="preserve">Để kiểm tra độ bền của kết luận, một stress test độc lập được chạy trên sáu bệnh complete với năm mức missingness lịch sử (10%, 20%, 40%, 60%, 80%), ba cơ chế tiêm (MCAR ngẫu nhiên, outage theo block liên tiếp, và censor phụ thuộc mức ca), ba horizon (1, 2, 4 tuần), 20 lần lặp và cluster-bootstrap 95%. Chỉ mask của lịch sử trước test bị thay đổi; toàn bộ 20 origin cuối và target của chúng được khóa nguyên vẹn.</w:t>
+      </w:r>
+    </w:p>
+    <w:tbl>
+      <w:tblPr>
+        <w:tblW w:type="dxa" w:w="10800"/>
+        <w:tblBorders>
+          <w:top w:val="single" w:color="auto" w:sz="4"/>
+          <w:left w:val="single" w:color="auto" w:sz="4"/>
+          <w:bottom w:val="single" w:color="auto" w:sz="4"/>
+          <w:right w:val="single" w:color="auto" w:sz="4"/>
+          <w:insideH w:val="single" w:color="auto" w:sz="4"/>
+          <w:insideV w:val="single" w:color="auto" w:sz="4"/>
+        </w:tblBorders>
+      </w:tblPr>
+      <w:tblGrid>
+        <w:gridCol w:w="2200"/>
+        <w:gridCol w:w="1500"/>
+        <w:gridCol w:w="1100"/>
+        <w:gridCol w:w="1500"/>
+        <w:gridCol w:w="1500"/>
+        <w:gridCol w:w="3000"/>
+      </w:tblGrid>
+      <w:tr>
+        <w:trPr>
+          <w:tblHeader/>
+        </w:trPr>
+        <w:tc>
+          <w:tcPr>
+            <w:tcW w:type="dxa" w:w="2200"/>
+            <w:shd w:fill="E8EEF7" w:color="auto" w:val="clear"/>
+          </w:tcPr>
+          <w:p>
+            <w:r>
+              <w:rPr>
+                <w:b/>
+                <w:bCs/>
+                <w:sz w:val="19"/>
+                <w:szCs w:val="19"/>
+              </w:rPr>
+              <w:t xml:space="preserve">Cơ chế</w:t>
+            </w:r>
+          </w:p>
+        </w:tc>
+        <w:tc>
+          <w:tcPr>
+            <w:tcW w:type="dxa" w:w="1500"/>
+            <w:shd w:fill="E8EEF7" w:color="auto" w:val="clear"/>
+          </w:tcPr>
+          <w:p>
+            <w:r>
+              <w:rPr>
+                <w:b/>
+                <w:bCs/>
+                <w:sz w:val="19"/>
+                <w:szCs w:val="19"/>
+              </w:rPr>
+              <w:t xml:space="preserve">Missingness</w:t>
+            </w:r>
+          </w:p>
+        </w:tc>
+        <w:tc>
+          <w:tcPr>
+            <w:tcW w:type="dxa" w:w="1100"/>
+            <w:shd w:fill="E8EEF7" w:color="auto" w:val="clear"/>
+          </w:tcPr>
+          <w:p>
+            <w:r>
+              <w:rPr>
+                <w:b/>
+                <w:bCs/>
+                <w:sz w:val="19"/>
+                <w:szCs w:val="19"/>
+              </w:rPr>
+              <w:t xml:space="preserve">Horizon</w:t>
+            </w:r>
+          </w:p>
+        </w:tc>
+        <w:tc>
+          <w:tcPr>
+            <w:tcW w:type="dxa" w:w="1500"/>
+            <w:shd w:fill="E8EEF7" w:color="auto" w:val="clear"/>
+          </w:tcPr>
+          <w:p>
+            <w:r>
+              <w:rPr>
+                <w:b/>
+                <w:bCs/>
+                <w:sz w:val="19"/>
+                <w:szCs w:val="19"/>
+              </w:rPr>
+              <w:t xml:space="preserve">MAE zero</w:t>
+            </w:r>
+          </w:p>
+        </w:tc>
+        <w:tc>
+          <w:tcPr>
+            <w:tcW w:type="dxa" w:w="1500"/>
+            <w:shd w:fill="E8EEF7" w:color="auto" w:val="clear"/>
+          </w:tcPr>
+          <w:p>
+            <w:r>
+              <w:rPr>
+                <w:b/>
+                <w:bCs/>
+                <w:sz w:val="19"/>
+                <w:szCs w:val="19"/>
+              </w:rPr>
+              <w:t xml:space="preserve">MAE aware</w:t>
+            </w:r>
+          </w:p>
+        </w:tc>
+        <w:tc>
+          <w:tcPr>
+            <w:tcW w:type="dxa" w:w="3000"/>
+            <w:shd w:fill="E8EEF7" w:color="auto" w:val="clear"/>
+          </w:tcPr>
+          <w:p>
+            <w:r>
+              <w:rPr>
+                <w:b/>
+                <w:bCs/>
+                <w:sz w:val="19"/>
+                <w:szCs w:val="19"/>
+              </w:rPr>
+              <w:t xml:space="preserve">Δ zero − aware (95% CI)</w:t>
+            </w:r>
+          </w:p>
+        </w:tc>
+      </w:tr>
+      <w:tr>
+        <w:tc>
+          <w:tcPr>
+            <w:tcW w:type="dxa" w:w="2200"/>
+          </w:tcPr>
+          <w:p>
+            <w:pPr>
+              <w:jc w:val="left"/>
+            </w:pPr>
+            <w:r>
+              <w:rPr>
+                <w:b w:val="false"/>
+                <w:bCs w:val="false"/>
+                <w:sz w:val="19"/>
+                <w:szCs w:val="19"/>
+              </w:rPr>
+              <w:t xml:space="preserve">MCAR</w:t>
+            </w:r>
+          </w:p>
+        </w:tc>
+        <w:tc>
+          <w:tcPr>
+            <w:tcW w:type="dxa" w:w="1500"/>
+          </w:tcPr>
+          <w:p>
+            <w:pPr>
+              <w:jc w:val="right"/>
+            </w:pPr>
+            <w:r>
+              <w:rPr>
+                <w:b w:val="false"/>
+                <w:bCs w:val="false"/>
+                <w:sz w:val="19"/>
+                <w:szCs w:val="19"/>
+              </w:rPr>
+              <w:t xml:space="preserve">40%</w:t>
+            </w:r>
+          </w:p>
+        </w:tc>
+        <w:tc>
+          <w:tcPr>
+            <w:tcW w:type="dxa" w:w="1100"/>
+          </w:tcPr>
+          <w:p>
+            <w:pPr>
+              <w:jc w:val="right"/>
+            </w:pPr>
+            <w:r>
+              <w:rPr>
+                <w:b w:val="false"/>
+                <w:bCs w:val="false"/>
+                <w:sz w:val="19"/>
+                <w:szCs w:val="19"/>
+              </w:rPr>
+              <w:t xml:space="preserve">4</w:t>
+            </w:r>
+          </w:p>
+        </w:tc>
+        <w:tc>
+          <w:tcPr>
+            <w:tcW w:type="dxa" w:w="1500"/>
+          </w:tcPr>
+          <w:p>
+            <w:pPr>
+              <w:jc w:val="right"/>
+            </w:pPr>
+            <w:r>
+              <w:rPr>
+                <w:b w:val="false"/>
+                <w:bCs w:val="false"/>
+                <w:sz w:val="19"/>
+                <w:szCs w:val="19"/>
+              </w:rPr>
+              <w:t xml:space="preserve">65,47</w:t>
+            </w:r>
+          </w:p>
+        </w:tc>
+        <w:tc>
+          <w:tcPr>
+            <w:tcW w:type="dxa" w:w="1500"/>
+          </w:tcPr>
+          <w:p>
+            <w:pPr>
+              <w:jc w:val="right"/>
+            </w:pPr>
+            <w:r>
+              <w:rPr>
+                <w:b w:val="false"/>
+                <w:bCs w:val="false"/>
+                <w:sz w:val="19"/>
+                <w:szCs w:val="19"/>
+              </w:rPr>
+              <w:t xml:space="preserve">59,46</w:t>
+            </w:r>
+          </w:p>
+        </w:tc>
+        <w:tc>
+          <w:tcPr>
+            <w:tcW w:type="dxa" w:w="3000"/>
+          </w:tcPr>
+          <w:p>
+            <w:pPr>
+              <w:jc w:val="right"/>
+            </w:pPr>
+            <w:r>
+              <w:rPr>
+                <w:b w:val="false"/>
+                <w:bCs w:val="false"/>
+                <w:sz w:val="19"/>
+                <w:szCs w:val="19"/>
+              </w:rPr>
+              <w:t xml:space="preserve">+6,01 [3,77; 8,64]</w:t>
+            </w:r>
+          </w:p>
+        </w:tc>
+      </w:tr>
+      <w:tr>
+        <w:tc>
+          <w:tcPr>
+            <w:tcW w:type="dxa" w:w="2200"/>
+          </w:tcPr>
+          <w:p>
+            <w:pPr>
+              <w:jc w:val="left"/>
+            </w:pPr>
+            <w:r>
+              <w:rPr>
+                <w:b w:val="false"/>
+                <w:bCs w:val="false"/>
+                <w:sz w:val="19"/>
+                <w:szCs w:val="19"/>
+              </w:rPr>
+              <w:t xml:space="preserve">MCAR</w:t>
+            </w:r>
+          </w:p>
+        </w:tc>
+        <w:tc>
+          <w:tcPr>
+            <w:tcW w:type="dxa" w:w="1500"/>
+          </w:tcPr>
+          <w:p>
+            <w:pPr>
+              <w:jc w:val="right"/>
+            </w:pPr>
+            <w:r>
+              <w:rPr>
+                <w:b w:val="false"/>
+                <w:bCs w:val="false"/>
+                <w:sz w:val="19"/>
+                <w:szCs w:val="19"/>
+              </w:rPr>
+              <w:t xml:space="preserve">80%</w:t>
+            </w:r>
+          </w:p>
+        </w:tc>
+        <w:tc>
+          <w:tcPr>
+            <w:tcW w:type="dxa" w:w="1100"/>
+          </w:tcPr>
+          <w:p>
+            <w:pPr>
+              <w:jc w:val="right"/>
+            </w:pPr>
+            <w:r>
+              <w:rPr>
+                <w:b w:val="false"/>
+                <w:bCs w:val="false"/>
+                <w:sz w:val="19"/>
+                <w:szCs w:val="19"/>
+              </w:rPr>
+              <w:t xml:space="preserve">4</w:t>
+            </w:r>
+          </w:p>
+        </w:tc>
+        <w:tc>
+          <w:tcPr>
+            <w:tcW w:type="dxa" w:w="1500"/>
+          </w:tcPr>
+          <w:p>
+            <w:pPr>
+              <w:jc w:val="right"/>
+            </w:pPr>
+            <w:r>
+              <w:rPr>
+                <w:b w:val="false"/>
+                <w:bCs w:val="false"/>
+                <w:sz w:val="19"/>
+                <w:szCs w:val="19"/>
+              </w:rPr>
+              <w:t xml:space="preserve">72,24</w:t>
+            </w:r>
+          </w:p>
+        </w:tc>
+        <w:tc>
+          <w:tcPr>
+            <w:tcW w:type="dxa" w:w="1500"/>
+          </w:tcPr>
+          <w:p>
+            <w:pPr>
+              <w:jc w:val="right"/>
+            </w:pPr>
+            <w:r>
+              <w:rPr>
+                <w:b w:val="false"/>
+                <w:bCs w:val="false"/>
+                <w:sz w:val="19"/>
+                <w:szCs w:val="19"/>
+              </w:rPr>
+              <w:t xml:space="preserve">60,41</w:t>
+            </w:r>
+          </w:p>
+        </w:tc>
+        <w:tc>
+          <w:tcPr>
+            <w:tcW w:type="dxa" w:w="3000"/>
+          </w:tcPr>
+          <w:p>
+            <w:pPr>
+              <w:jc w:val="right"/>
+            </w:pPr>
+            <w:r>
+              <w:rPr>
+                <w:b w:val="false"/>
+                <w:bCs w:val="false"/>
+                <w:sz w:val="19"/>
+                <w:szCs w:val="19"/>
+              </w:rPr>
+              <w:t xml:space="preserve">+11,83 [7,04; 17,22]</w:t>
+            </w:r>
+          </w:p>
+        </w:tc>
+      </w:tr>
+      <w:tr>
+        <w:tc>
+          <w:tcPr>
+            <w:tcW w:type="dxa" w:w="2200"/>
+          </w:tcPr>
+          <w:p>
+            <w:pPr>
+              <w:jc w:val="left"/>
+            </w:pPr>
+            <w:r>
+              <w:rPr>
+                <w:b w:val="false"/>
+                <w:bCs w:val="false"/>
+                <w:sz w:val="19"/>
+                <w:szCs w:val="19"/>
+              </w:rPr>
+              <w:t xml:space="preserve">Block outage</w:t>
+            </w:r>
+          </w:p>
+        </w:tc>
+        <w:tc>
+          <w:tcPr>
+            <w:tcW w:type="dxa" w:w="1500"/>
+          </w:tcPr>
+          <w:p>
+            <w:pPr>
+              <w:jc w:val="right"/>
+            </w:pPr>
+            <w:r>
+              <w:rPr>
+                <w:b w:val="false"/>
+                <w:bCs w:val="false"/>
+                <w:sz w:val="19"/>
+                <w:szCs w:val="19"/>
+              </w:rPr>
+              <w:t xml:space="preserve">40%</w:t>
+            </w:r>
+          </w:p>
+        </w:tc>
+        <w:tc>
+          <w:tcPr>
+            <w:tcW w:type="dxa" w:w="1100"/>
+          </w:tcPr>
+          <w:p>
+            <w:pPr>
+              <w:jc w:val="right"/>
+            </w:pPr>
+            <w:r>
+              <w:rPr>
+                <w:b w:val="false"/>
+                <w:bCs w:val="false"/>
+                <w:sz w:val="19"/>
+                <w:szCs w:val="19"/>
+              </w:rPr>
+              <w:t xml:space="preserve">4</w:t>
+            </w:r>
+          </w:p>
+        </w:tc>
+        <w:tc>
+          <w:tcPr>
+            <w:tcW w:type="dxa" w:w="1500"/>
+          </w:tcPr>
+          <w:p>
+            <w:pPr>
+              <w:jc w:val="right"/>
+            </w:pPr>
+            <w:r>
+              <w:rPr>
+                <w:b w:val="false"/>
+                <w:bCs w:val="false"/>
+                <w:sz w:val="19"/>
+                <w:szCs w:val="19"/>
+              </w:rPr>
+              <w:t xml:space="preserve">66,05</w:t>
+            </w:r>
+          </w:p>
+        </w:tc>
+        <w:tc>
+          <w:tcPr>
+            <w:tcW w:type="dxa" w:w="1500"/>
+          </w:tcPr>
+          <w:p>
+            <w:pPr>
+              <w:jc w:val="right"/>
+            </w:pPr>
+            <w:r>
+              <w:rPr>
+                <w:b w:val="false"/>
+                <w:bCs w:val="false"/>
+                <w:sz w:val="19"/>
+                <w:szCs w:val="19"/>
+              </w:rPr>
+              <w:t xml:space="preserve">59,98</w:t>
+            </w:r>
+          </w:p>
+        </w:tc>
+        <w:tc>
+          <w:tcPr>
+            <w:tcW w:type="dxa" w:w="3000"/>
+          </w:tcPr>
+          <w:p>
+            <w:pPr>
+              <w:jc w:val="right"/>
+            </w:pPr>
+            <w:r>
+              <w:rPr>
+                <w:b w:val="false"/>
+                <w:bCs w:val="false"/>
+                <w:sz w:val="19"/>
+                <w:szCs w:val="19"/>
+              </w:rPr>
+              <w:t xml:space="preserve">+6,07 [3,39; 9,63]</w:t>
+            </w:r>
+          </w:p>
+        </w:tc>
+      </w:tr>
+      <w:tr>
+        <w:tc>
+          <w:tcPr>
+            <w:tcW w:type="dxa" w:w="2200"/>
+          </w:tcPr>
+          <w:p>
+            <w:pPr>
+              <w:jc w:val="left"/>
+            </w:pPr>
+            <w:r>
+              <w:rPr>
+                <w:b w:val="false"/>
+                <w:bCs w:val="false"/>
+                <w:sz w:val="19"/>
+                <w:szCs w:val="19"/>
+              </w:rPr>
+              <w:t xml:space="preserve">Block outage</w:t>
+            </w:r>
+          </w:p>
+        </w:tc>
+        <w:tc>
+          <w:tcPr>
+            <w:tcW w:type="dxa" w:w="1500"/>
+          </w:tcPr>
+          <w:p>
+            <w:pPr>
+              <w:jc w:val="right"/>
+            </w:pPr>
+            <w:r>
+              <w:rPr>
+                <w:b w:val="false"/>
+                <w:bCs w:val="false"/>
+                <w:sz w:val="19"/>
+                <w:szCs w:val="19"/>
+              </w:rPr>
+              <w:t xml:space="preserve">80%</w:t>
+            </w:r>
+          </w:p>
+        </w:tc>
+        <w:tc>
+          <w:tcPr>
+            <w:tcW w:type="dxa" w:w="1100"/>
+          </w:tcPr>
+          <w:p>
+            <w:pPr>
+              <w:jc w:val="right"/>
+            </w:pPr>
+            <w:r>
+              <w:rPr>
+                <w:b w:val="false"/>
+                <w:bCs w:val="false"/>
+                <w:sz w:val="19"/>
+                <w:szCs w:val="19"/>
+              </w:rPr>
+              <w:t xml:space="preserve">4</w:t>
+            </w:r>
+          </w:p>
+        </w:tc>
+        <w:tc>
+          <w:tcPr>
+            <w:tcW w:type="dxa" w:w="1500"/>
+          </w:tcPr>
+          <w:p>
+            <w:pPr>
+              <w:jc w:val="right"/>
+            </w:pPr>
+            <w:r>
+              <w:rPr>
+                <w:b w:val="false"/>
+                <w:bCs w:val="false"/>
+                <w:sz w:val="19"/>
+                <w:szCs w:val="19"/>
+              </w:rPr>
+              <w:t xml:space="preserve">71,81</w:t>
+            </w:r>
+          </w:p>
+        </w:tc>
+        <w:tc>
+          <w:tcPr>
+            <w:tcW w:type="dxa" w:w="1500"/>
+          </w:tcPr>
+          <w:p>
+            <w:pPr>
+              <w:jc w:val="right"/>
+            </w:pPr>
+            <w:r>
+              <w:rPr>
+                <w:b w:val="false"/>
+                <w:bCs w:val="false"/>
+                <w:sz w:val="19"/>
+                <w:szCs w:val="19"/>
+              </w:rPr>
+              <w:t xml:space="preserve">63,30</w:t>
+            </w:r>
+          </w:p>
+        </w:tc>
+        <w:tc>
+          <w:tcPr>
+            <w:tcW w:type="dxa" w:w="3000"/>
+          </w:tcPr>
+          <w:p>
+            <w:pPr>
+              <w:jc w:val="right"/>
+            </w:pPr>
+            <w:r>
+              <w:rPr>
+                <w:b w:val="false"/>
+                <w:bCs w:val="false"/>
+                <w:sz w:val="19"/>
+                <w:szCs w:val="19"/>
+              </w:rPr>
+              <w:t xml:space="preserve">+8,51 [4,58; 13,26]</w:t>
+            </w:r>
+          </w:p>
+        </w:tc>
+      </w:tr>
+      <w:tr>
+        <w:tc>
+          <w:tcPr>
+            <w:tcW w:type="dxa" w:w="2200"/>
+          </w:tcPr>
+          <w:p>
+            <w:pPr>
+              <w:jc w:val="left"/>
+            </w:pPr>
+            <w:r>
+              <w:rPr>
+                <w:b w:val="false"/>
+                <w:bCs w:val="false"/>
+                <w:sz w:val="19"/>
+                <w:szCs w:val="19"/>
+              </w:rPr>
+              <w:t xml:space="preserve">Value-dependent</w:t>
+            </w:r>
+          </w:p>
+        </w:tc>
+        <w:tc>
+          <w:tcPr>
+            <w:tcW w:type="dxa" w:w="1500"/>
+          </w:tcPr>
+          <w:p>
+            <w:pPr>
+              <w:jc w:val="right"/>
+            </w:pPr>
+            <w:r>
+              <w:rPr>
+                <w:b w:val="false"/>
+                <w:bCs w:val="false"/>
+                <w:sz w:val="19"/>
+                <w:szCs w:val="19"/>
+              </w:rPr>
+              <w:t xml:space="preserve">40%</w:t>
+            </w:r>
+          </w:p>
+        </w:tc>
+        <w:tc>
+          <w:tcPr>
+            <w:tcW w:type="dxa" w:w="1100"/>
+          </w:tcPr>
+          <w:p>
+            <w:pPr>
+              <w:jc w:val="right"/>
+            </w:pPr>
+            <w:r>
+              <w:rPr>
+                <w:b w:val="false"/>
+                <w:bCs w:val="false"/>
+                <w:sz w:val="19"/>
+                <w:szCs w:val="19"/>
+              </w:rPr>
+              <w:t xml:space="preserve">4</w:t>
+            </w:r>
+          </w:p>
+        </w:tc>
+        <w:tc>
+          <w:tcPr>
+            <w:tcW w:type="dxa" w:w="1500"/>
+          </w:tcPr>
+          <w:p>
+            <w:pPr>
+              <w:jc w:val="right"/>
+            </w:pPr>
+            <w:r>
+              <w:rPr>
+                <w:b w:val="false"/>
+                <w:bCs w:val="false"/>
+                <w:sz w:val="19"/>
+                <w:szCs w:val="19"/>
+              </w:rPr>
+              <w:t xml:space="preserve">64,05</w:t>
+            </w:r>
+          </w:p>
+        </w:tc>
+        <w:tc>
+          <w:tcPr>
+            <w:tcW w:type="dxa" w:w="1500"/>
+          </w:tcPr>
+          <w:p>
+            <w:pPr>
+              <w:jc w:val="right"/>
+            </w:pPr>
+            <w:r>
+              <w:rPr>
+                <w:b w:val="false"/>
+                <w:bCs w:val="false"/>
+                <w:sz w:val="19"/>
+                <w:szCs w:val="19"/>
+              </w:rPr>
+              <w:t xml:space="preserve">59,18</w:t>
+            </w:r>
+          </w:p>
+        </w:tc>
+        <w:tc>
+          <w:tcPr>
+            <w:tcW w:type="dxa" w:w="3000"/>
+          </w:tcPr>
+          <w:p>
+            <w:pPr>
+              <w:jc w:val="right"/>
+            </w:pPr>
+            <w:r>
+              <w:rPr>
+                <w:b w:val="false"/>
+                <w:bCs w:val="false"/>
+                <w:sz w:val="19"/>
+                <w:szCs w:val="19"/>
+              </w:rPr>
+              <w:t xml:space="preserve">+4,87 [2,69; 7,55]</w:t>
+            </w:r>
+          </w:p>
+        </w:tc>
+      </w:tr>
+      <w:tr>
+        <w:tc>
+          <w:tcPr>
+            <w:tcW w:type="dxa" w:w="2200"/>
+          </w:tcPr>
+          <w:p>
+            <w:pPr>
+              <w:jc w:val="left"/>
+            </w:pPr>
+            <w:r>
+              <w:rPr>
+                <w:b w:val="false"/>
+                <w:bCs w:val="false"/>
+                <w:sz w:val="19"/>
+                <w:szCs w:val="19"/>
+              </w:rPr>
+              <w:t xml:space="preserve">Value-dependent</w:t>
+            </w:r>
+          </w:p>
+        </w:tc>
+        <w:tc>
+          <w:tcPr>
+            <w:tcW w:type="dxa" w:w="1500"/>
+          </w:tcPr>
+          <w:p>
+            <w:pPr>
+              <w:jc w:val="right"/>
+            </w:pPr>
+            <w:r>
+              <w:rPr>
+                <w:b w:val="false"/>
+                <w:bCs w:val="false"/>
+                <w:sz w:val="19"/>
+                <w:szCs w:val="19"/>
+              </w:rPr>
+              <w:t xml:space="preserve">80%</w:t>
+            </w:r>
+          </w:p>
+        </w:tc>
+        <w:tc>
+          <w:tcPr>
+            <w:tcW w:type="dxa" w:w="1100"/>
+          </w:tcPr>
+          <w:p>
+            <w:pPr>
+              <w:jc w:val="right"/>
+            </w:pPr>
+            <w:r>
+              <w:rPr>
+                <w:b w:val="false"/>
+                <w:bCs w:val="false"/>
+                <w:sz w:val="19"/>
+                <w:szCs w:val="19"/>
+              </w:rPr>
+              <w:t xml:space="preserve">4</w:t>
+            </w:r>
+          </w:p>
+        </w:tc>
+        <w:tc>
+          <w:tcPr>
+            <w:tcW w:type="dxa" w:w="1500"/>
+          </w:tcPr>
+          <w:p>
+            <w:pPr>
+              <w:jc w:val="right"/>
+            </w:pPr>
+            <w:r>
+              <w:rPr>
+                <w:b w:val="false"/>
+                <w:bCs w:val="false"/>
+                <w:sz w:val="19"/>
+                <w:szCs w:val="19"/>
+              </w:rPr>
+              <w:t xml:space="preserve">72,38</w:t>
+            </w:r>
+          </w:p>
+        </w:tc>
+        <w:tc>
+          <w:tcPr>
+            <w:tcW w:type="dxa" w:w="1500"/>
+          </w:tcPr>
+          <w:p>
+            <w:pPr>
+              <w:jc w:val="right"/>
+            </w:pPr>
+            <w:r>
+              <w:rPr>
+                <w:b w:val="false"/>
+                <w:bCs w:val="false"/>
+                <w:sz w:val="19"/>
+                <w:szCs w:val="19"/>
+              </w:rPr>
+              <w:t xml:space="preserve">59,98</w:t>
+            </w:r>
+          </w:p>
+        </w:tc>
+        <w:tc>
+          <w:tcPr>
+            <w:tcW w:type="dxa" w:w="3000"/>
+          </w:tcPr>
+          <w:p>
+            <w:pPr>
+              <w:jc w:val="right"/>
+            </w:pPr>
+            <w:r>
+              <w:rPr>
+                <w:b w:val="false"/>
+                <w:bCs w:val="false"/>
+                <w:sz w:val="19"/>
+                <w:szCs w:val="19"/>
+              </w:rPr>
+              <w:t xml:space="preserve">+12,40 [7,56; 18,46]</w:t>
+            </w:r>
+          </w:p>
+        </w:tc>
+      </w:tr>
+    </w:tbl>
+    <w:p>
+      <w:pPr>
+        <w:spacing w:after="160" w:line="300"/>
+        <w:jc w:val="both"/>
+      </w:pPr>
+      <w:r>
+        <w:rPr>
+          <w:b w:val="false"/>
+          <w:bCs w:val="false"/>
+          <w:i w:val="false"/>
+          <w:iCs w:val="false"/>
+        </w:rPr>
+        <w:t xml:space="preserve">Reporting-aware giữ lợi thế ở cả ba cơ chế và lợi thế tăng rõ theo tỷ lệ missingness, đặc biệt tại horizon dài. Ở mức 40% và horizon 4, chênh lệch zero − aware khoảng 4,87–6,07 MAE; ở mức 80%, khoảng 8,51–12,40 MAE, với toàn bộ khoảng tin cậy bootstrap nằm trên 0. Kết quả này củng cố kết luận rằng zero-filling không chỉ thất bại dưới một kiểu missingness duy nhất. Đây vẫn là bằng chứng mô phỏng có kiểm soát trên protocol nghiên cứu, không phải ước lượng nhân quả về incidence thật.</w:t>
+      </w:r>
+    </w:p>
+    <w:p>
+      <w:pPr>
+        <w:pStyle w:val="Heading2"/>
+        <w:spacing w:after="120" w:before="280"/>
+      </w:pPr>
+      <w:r>
+        <w:t xml:space="preserve">5.14 Hiệu năng hệ thống</w:t>
       </w:r>
     </w:p>
     <w:tbl>

</xml_diff>

<commit_message>
Add temporal generalization and feature ablation
</commit_message>
<xml_diff>
--- a/manuscript/ProjectA_BaoCao_Draft_Audited.docx
+++ b/manuscript/ProjectA_BaoCao_Draft_Audited.docx
@@ -5939,7 +5939,1054 @@
         <w:spacing w:after="120" w:before="280"/>
       </w:pPr>
       <w:r>
-        <w:t xml:space="preserve">5.14 Hiệu năng hệ thống</w:t>
+        <w:t xml:space="preserve">5.14 Khả năng tổng quát theo thời gian</w:t>
+      </w:r>
+    </w:p>
+    <w:p>
+      <w:pPr>
+        <w:spacing w:after="160" w:line="300"/>
+        <w:jc w:val="both"/>
+      </w:pPr>
+      <w:r>
+        <w:rPr>
+          <w:b w:val="false"/>
+          <w:bCs w:val="false"/>
+          <w:i w:val="false"/>
+          <w:iCs w:val="false"/>
+        </w:rPr>
+        <w:t xml:space="preserve">Để tránh việc kết luận chỉ phụ thuộc vào 20 origin cuối, LightGBM với đầy đủ observation-mask được đánh giá trên bốn test block lịch sử bắt đầu tại t = 80, 100, 120 và 140; mỗi block có 12 origin, train chỉ dùng dữ liệu trước block. Reporting-aware không thắng đồng nhất ở mọi block: nó cải thiện nhẹ tại block t = 80 (horizon 4: 39,08 so với 39,79) và t = 140 (horizon 2: 33,99 so với 34,10), nhưng kém hơn ở một số horizon tại t = 100 và t = 120. Điều này cho thấy hiệu quả phụ thuộc vào regime báo cáo và cần được diễn giải là conditional robustness, không phải ưu thế phổ quát.</w:t>
+      </w:r>
+    </w:p>
+    <w:tbl>
+      <w:tblPr>
+        <w:tblW w:type="dxa" w:w="11000"/>
+        <w:tblBorders>
+          <w:top w:val="single" w:color="auto" w:sz="4"/>
+          <w:left w:val="single" w:color="auto" w:sz="4"/>
+          <w:bottom w:val="single" w:color="auto" w:sz="4"/>
+          <w:right w:val="single" w:color="auto" w:sz="4"/>
+          <w:insideH w:val="single" w:color="auto" w:sz="4"/>
+          <w:insideV w:val="single" w:color="auto" w:sz="4"/>
+        </w:tblBorders>
+      </w:tblPr>
+      <w:tblGrid>
+        <w:gridCol w:w="2200"/>
+        <w:gridCol w:w="1300"/>
+        <w:gridCol w:w="2300"/>
+        <w:gridCol w:w="2200"/>
+        <w:gridCol w:w="3000"/>
+      </w:tblGrid>
+      <w:tr>
+        <w:trPr>
+          <w:tblHeader/>
+        </w:trPr>
+        <w:tc>
+          <w:tcPr>
+            <w:tcW w:type="dxa" w:w="2200"/>
+            <w:shd w:fill="E8EEF7" w:color="auto" w:val="clear"/>
+          </w:tcPr>
+          <w:p>
+            <w:r>
+              <w:rPr>
+                <w:b/>
+                <w:bCs/>
+                <w:sz w:val="19"/>
+                <w:szCs w:val="19"/>
+              </w:rPr>
+              <w:t xml:space="preserve">Test block</w:t>
+            </w:r>
+          </w:p>
+        </w:tc>
+        <w:tc>
+          <w:tcPr>
+            <w:tcW w:type="dxa" w:w="1300"/>
+            <w:shd w:fill="E8EEF7" w:color="auto" w:val="clear"/>
+          </w:tcPr>
+          <w:p>
+            <w:r>
+              <w:rPr>
+                <w:b/>
+                <w:bCs/>
+                <w:sz w:val="19"/>
+                <w:szCs w:val="19"/>
+              </w:rPr>
+              <w:t xml:space="preserve">Horizon</w:t>
+            </w:r>
+          </w:p>
+        </w:tc>
+        <w:tc>
+          <w:tcPr>
+            <w:tcW w:type="dxa" w:w="2300"/>
+            <w:shd w:fill="E8EEF7" w:color="auto" w:val="clear"/>
+          </w:tcPr>
+          <w:p>
+            <w:r>
+              <w:rPr>
+                <w:b/>
+                <w:bCs/>
+                <w:sz w:val="19"/>
+                <w:szCs w:val="19"/>
+              </w:rPr>
+              <w:t xml:space="preserve">MAE zero-fill</w:t>
+            </w:r>
+          </w:p>
+        </w:tc>
+        <w:tc>
+          <w:tcPr>
+            <w:tcW w:type="dxa" w:w="2200"/>
+            <w:shd w:fill="E8EEF7" w:color="auto" w:val="clear"/>
+          </w:tcPr>
+          <w:p>
+            <w:r>
+              <w:rPr>
+                <w:b/>
+                <w:bCs/>
+                <w:sz w:val="19"/>
+                <w:szCs w:val="19"/>
+              </w:rPr>
+              <w:t xml:space="preserve">MAE aware</w:t>
+            </w:r>
+          </w:p>
+        </w:tc>
+        <w:tc>
+          <w:tcPr>
+            <w:tcW w:type="dxa" w:w="3000"/>
+            <w:shd w:fill="E8EEF7" w:color="auto" w:val="clear"/>
+          </w:tcPr>
+          <w:p>
+            <w:r>
+              <w:rPr>
+                <w:b/>
+                <w:bCs/>
+                <w:sz w:val="19"/>
+                <w:szCs w:val="19"/>
+              </w:rPr>
+              <w:t xml:space="preserve">Aware tốt hơn?</w:t>
+            </w:r>
+          </w:p>
+        </w:tc>
+      </w:tr>
+      <w:tr>
+        <w:tc>
+          <w:tcPr>
+            <w:tcW w:type="dxa" w:w="2200"/>
+          </w:tcPr>
+          <w:p>
+            <w:pPr>
+              <w:jc w:val="left"/>
+            </w:pPr>
+            <w:r>
+              <w:rPr>
+                <w:b w:val="false"/>
+                <w:bCs w:val="false"/>
+                <w:sz w:val="19"/>
+                <w:szCs w:val="19"/>
+              </w:rPr>
+              <w:t xml:space="preserve">t = 80</w:t>
+            </w:r>
+          </w:p>
+        </w:tc>
+        <w:tc>
+          <w:tcPr>
+            <w:tcW w:type="dxa" w:w="1300"/>
+          </w:tcPr>
+          <w:p>
+            <w:pPr>
+              <w:jc w:val="right"/>
+            </w:pPr>
+            <w:r>
+              <w:rPr>
+                <w:b w:val="false"/>
+                <w:bCs w:val="false"/>
+                <w:sz w:val="19"/>
+                <w:szCs w:val="19"/>
+              </w:rPr>
+              <w:t xml:space="preserve">1</w:t>
+            </w:r>
+          </w:p>
+        </w:tc>
+        <w:tc>
+          <w:tcPr>
+            <w:tcW w:type="dxa" w:w="2300"/>
+          </w:tcPr>
+          <w:p>
+            <w:pPr>
+              <w:jc w:val="right"/>
+            </w:pPr>
+            <w:r>
+              <w:rPr>
+                <w:b w:val="false"/>
+                <w:bCs w:val="false"/>
+                <w:sz w:val="19"/>
+                <w:szCs w:val="19"/>
+              </w:rPr>
+              <w:t xml:space="preserve">52,44</w:t>
+            </w:r>
+          </w:p>
+        </w:tc>
+        <w:tc>
+          <w:tcPr>
+            <w:tcW w:type="dxa" w:w="2200"/>
+          </w:tcPr>
+          <w:p>
+            <w:pPr>
+              <w:jc w:val="right"/>
+            </w:pPr>
+            <w:r>
+              <w:rPr>
+                <w:b w:val="false"/>
+                <w:bCs w:val="false"/>
+                <w:sz w:val="19"/>
+                <w:szCs w:val="19"/>
+              </w:rPr>
+              <w:t xml:space="preserve">52,44</w:t>
+            </w:r>
+          </w:p>
+        </w:tc>
+        <w:tc>
+          <w:tcPr>
+            <w:tcW w:type="dxa" w:w="3000"/>
+          </w:tcPr>
+          <w:p>
+            <w:pPr>
+              <w:jc w:val="right"/>
+            </w:pPr>
+            <w:r>
+              <w:rPr>
+                <w:b w:val="false"/>
+                <w:bCs w:val="false"/>
+                <w:sz w:val="19"/>
+                <w:szCs w:val="19"/>
+              </w:rPr>
+              <w:t xml:space="preserve">Gần như hòa</w:t>
+            </w:r>
+          </w:p>
+        </w:tc>
+      </w:tr>
+      <w:tr>
+        <w:tc>
+          <w:tcPr>
+            <w:tcW w:type="dxa" w:w="2200"/>
+          </w:tcPr>
+          <w:p>
+            <w:pPr>
+              <w:jc w:val="left"/>
+            </w:pPr>
+            <w:r>
+              <w:rPr>
+                <w:b w:val="false"/>
+                <w:bCs w:val="false"/>
+                <w:sz w:val="19"/>
+                <w:szCs w:val="19"/>
+              </w:rPr>
+              <w:t xml:space="preserve">t = 80</w:t>
+            </w:r>
+          </w:p>
+        </w:tc>
+        <w:tc>
+          <w:tcPr>
+            <w:tcW w:type="dxa" w:w="1300"/>
+          </w:tcPr>
+          <w:p>
+            <w:pPr>
+              <w:jc w:val="right"/>
+            </w:pPr>
+            <w:r>
+              <w:rPr>
+                <w:b w:val="false"/>
+                <w:bCs w:val="false"/>
+                <w:sz w:val="19"/>
+                <w:szCs w:val="19"/>
+              </w:rPr>
+              <w:t xml:space="preserve">4</w:t>
+            </w:r>
+          </w:p>
+        </w:tc>
+        <w:tc>
+          <w:tcPr>
+            <w:tcW w:type="dxa" w:w="2300"/>
+          </w:tcPr>
+          <w:p>
+            <w:pPr>
+              <w:jc w:val="right"/>
+            </w:pPr>
+            <w:r>
+              <w:rPr>
+                <w:b w:val="false"/>
+                <w:bCs w:val="false"/>
+                <w:sz w:val="19"/>
+                <w:szCs w:val="19"/>
+              </w:rPr>
+              <w:t xml:space="preserve">39,79</w:t>
+            </w:r>
+          </w:p>
+        </w:tc>
+        <w:tc>
+          <w:tcPr>
+            <w:tcW w:type="dxa" w:w="2200"/>
+          </w:tcPr>
+          <w:p>
+            <w:pPr>
+              <w:jc w:val="right"/>
+            </w:pPr>
+            <w:r>
+              <w:rPr>
+                <w:b w:val="false"/>
+                <w:bCs w:val="false"/>
+                <w:sz w:val="19"/>
+                <w:szCs w:val="19"/>
+              </w:rPr>
+              <w:t xml:space="preserve">39,08</w:t>
+            </w:r>
+          </w:p>
+        </w:tc>
+        <w:tc>
+          <w:tcPr>
+            <w:tcW w:type="dxa" w:w="3000"/>
+          </w:tcPr>
+          <w:p>
+            <w:pPr>
+              <w:jc w:val="right"/>
+            </w:pPr>
+            <w:r>
+              <w:rPr>
+                <w:b w:val="false"/>
+                <w:bCs w:val="false"/>
+                <w:sz w:val="19"/>
+                <w:szCs w:val="19"/>
+              </w:rPr>
+              <w:t xml:space="preserve">Có</w:t>
+            </w:r>
+          </w:p>
+        </w:tc>
+      </w:tr>
+      <w:tr>
+        <w:tc>
+          <w:tcPr>
+            <w:tcW w:type="dxa" w:w="2200"/>
+          </w:tcPr>
+          <w:p>
+            <w:pPr>
+              <w:jc w:val="left"/>
+            </w:pPr>
+            <w:r>
+              <w:rPr>
+                <w:b w:val="false"/>
+                <w:bCs w:val="false"/>
+                <w:sz w:val="19"/>
+                <w:szCs w:val="19"/>
+              </w:rPr>
+              <w:t xml:space="preserve">t = 100</w:t>
+            </w:r>
+          </w:p>
+        </w:tc>
+        <w:tc>
+          <w:tcPr>
+            <w:tcW w:type="dxa" w:w="1300"/>
+          </w:tcPr>
+          <w:p>
+            <w:pPr>
+              <w:jc w:val="right"/>
+            </w:pPr>
+            <w:r>
+              <w:rPr>
+                <w:b w:val="false"/>
+                <w:bCs w:val="false"/>
+                <w:sz w:val="19"/>
+                <w:szCs w:val="19"/>
+              </w:rPr>
+              <w:t xml:space="preserve">1</w:t>
+            </w:r>
+          </w:p>
+        </w:tc>
+        <w:tc>
+          <w:tcPr>
+            <w:tcW w:type="dxa" w:w="2300"/>
+          </w:tcPr>
+          <w:p>
+            <w:pPr>
+              <w:jc w:val="right"/>
+            </w:pPr>
+            <w:r>
+              <w:rPr>
+                <w:b w:val="false"/>
+                <w:bCs w:val="false"/>
+                <w:sz w:val="19"/>
+                <w:szCs w:val="19"/>
+              </w:rPr>
+              <w:t xml:space="preserve">50,46</w:t>
+            </w:r>
+          </w:p>
+        </w:tc>
+        <w:tc>
+          <w:tcPr>
+            <w:tcW w:type="dxa" w:w="2200"/>
+          </w:tcPr>
+          <w:p>
+            <w:pPr>
+              <w:jc w:val="right"/>
+            </w:pPr>
+            <w:r>
+              <w:rPr>
+                <w:b w:val="false"/>
+                <w:bCs w:val="false"/>
+                <w:sz w:val="19"/>
+                <w:szCs w:val="19"/>
+              </w:rPr>
+              <w:t xml:space="preserve">51,08</w:t>
+            </w:r>
+          </w:p>
+        </w:tc>
+        <w:tc>
+          <w:tcPr>
+            <w:tcW w:type="dxa" w:w="3000"/>
+          </w:tcPr>
+          <w:p>
+            <w:pPr>
+              <w:jc w:val="right"/>
+            </w:pPr>
+            <w:r>
+              <w:rPr>
+                <w:b w:val="false"/>
+                <w:bCs w:val="false"/>
+                <w:sz w:val="19"/>
+                <w:szCs w:val="19"/>
+              </w:rPr>
+              <w:t xml:space="preserve">Không</w:t>
+            </w:r>
+          </w:p>
+        </w:tc>
+      </w:tr>
+      <w:tr>
+        <w:tc>
+          <w:tcPr>
+            <w:tcW w:type="dxa" w:w="2200"/>
+          </w:tcPr>
+          <w:p>
+            <w:pPr>
+              <w:jc w:val="left"/>
+            </w:pPr>
+            <w:r>
+              <w:rPr>
+                <w:b w:val="false"/>
+                <w:bCs w:val="false"/>
+                <w:sz w:val="19"/>
+                <w:szCs w:val="19"/>
+              </w:rPr>
+              <w:t xml:space="preserve">t = 120</w:t>
+            </w:r>
+          </w:p>
+        </w:tc>
+        <w:tc>
+          <w:tcPr>
+            <w:tcW w:type="dxa" w:w="1300"/>
+          </w:tcPr>
+          <w:p>
+            <w:pPr>
+              <w:jc w:val="right"/>
+            </w:pPr>
+            <w:r>
+              <w:rPr>
+                <w:b w:val="false"/>
+                <w:bCs w:val="false"/>
+                <w:sz w:val="19"/>
+                <w:szCs w:val="19"/>
+              </w:rPr>
+              <w:t xml:space="preserve">4</w:t>
+            </w:r>
+          </w:p>
+        </w:tc>
+        <w:tc>
+          <w:tcPr>
+            <w:tcW w:type="dxa" w:w="2300"/>
+          </w:tcPr>
+          <w:p>
+            <w:pPr>
+              <w:jc w:val="right"/>
+            </w:pPr>
+            <w:r>
+              <w:rPr>
+                <w:b w:val="false"/>
+                <w:bCs w:val="false"/>
+                <w:sz w:val="19"/>
+                <w:szCs w:val="19"/>
+              </w:rPr>
+              <w:t xml:space="preserve">33,59</w:t>
+            </w:r>
+          </w:p>
+        </w:tc>
+        <w:tc>
+          <w:tcPr>
+            <w:tcW w:type="dxa" w:w="2200"/>
+          </w:tcPr>
+          <w:p>
+            <w:pPr>
+              <w:jc w:val="right"/>
+            </w:pPr>
+            <w:r>
+              <w:rPr>
+                <w:b w:val="false"/>
+                <w:bCs w:val="false"/>
+                <w:sz w:val="19"/>
+                <w:szCs w:val="19"/>
+              </w:rPr>
+              <w:t xml:space="preserve">33,47</w:t>
+            </w:r>
+          </w:p>
+        </w:tc>
+        <w:tc>
+          <w:tcPr>
+            <w:tcW w:type="dxa" w:w="3000"/>
+          </w:tcPr>
+          <w:p>
+            <w:pPr>
+              <w:jc w:val="right"/>
+            </w:pPr>
+            <w:r>
+              <w:rPr>
+                <w:b w:val="false"/>
+                <w:bCs w:val="false"/>
+                <w:sz w:val="19"/>
+                <w:szCs w:val="19"/>
+              </w:rPr>
+              <w:t xml:space="preserve">Có, nhỏ</w:t>
+            </w:r>
+          </w:p>
+        </w:tc>
+      </w:tr>
+      <w:tr>
+        <w:tc>
+          <w:tcPr>
+            <w:tcW w:type="dxa" w:w="2200"/>
+          </w:tcPr>
+          <w:p>
+            <w:pPr>
+              <w:jc w:val="left"/>
+            </w:pPr>
+            <w:r>
+              <w:rPr>
+                <w:b w:val="false"/>
+                <w:bCs w:val="false"/>
+                <w:sz w:val="19"/>
+                <w:szCs w:val="19"/>
+              </w:rPr>
+              <w:t xml:space="preserve">t = 140</w:t>
+            </w:r>
+          </w:p>
+        </w:tc>
+        <w:tc>
+          <w:tcPr>
+            <w:tcW w:type="dxa" w:w="1300"/>
+          </w:tcPr>
+          <w:p>
+            <w:pPr>
+              <w:jc w:val="right"/>
+            </w:pPr>
+            <w:r>
+              <w:rPr>
+                <w:b w:val="false"/>
+                <w:bCs w:val="false"/>
+                <w:sz w:val="19"/>
+                <w:szCs w:val="19"/>
+              </w:rPr>
+              <w:t xml:space="preserve">2</w:t>
+            </w:r>
+          </w:p>
+        </w:tc>
+        <w:tc>
+          <w:tcPr>
+            <w:tcW w:type="dxa" w:w="2300"/>
+          </w:tcPr>
+          <w:p>
+            <w:pPr>
+              <w:jc w:val="right"/>
+            </w:pPr>
+            <w:r>
+              <w:rPr>
+                <w:b w:val="false"/>
+                <w:bCs w:val="false"/>
+                <w:sz w:val="19"/>
+                <w:szCs w:val="19"/>
+              </w:rPr>
+              <w:t xml:space="preserve">34,10</w:t>
+            </w:r>
+          </w:p>
+        </w:tc>
+        <w:tc>
+          <w:tcPr>
+            <w:tcW w:type="dxa" w:w="2200"/>
+          </w:tcPr>
+          <w:p>
+            <w:pPr>
+              <w:jc w:val="right"/>
+            </w:pPr>
+            <w:r>
+              <w:rPr>
+                <w:b w:val="false"/>
+                <w:bCs w:val="false"/>
+                <w:sz w:val="19"/>
+                <w:szCs w:val="19"/>
+              </w:rPr>
+              <w:t xml:space="preserve">33,99</w:t>
+            </w:r>
+          </w:p>
+        </w:tc>
+        <w:tc>
+          <w:tcPr>
+            <w:tcW w:type="dxa" w:w="3000"/>
+          </w:tcPr>
+          <w:p>
+            <w:pPr>
+              <w:jc w:val="right"/>
+            </w:pPr>
+            <w:r>
+              <w:rPr>
+                <w:b w:val="false"/>
+                <w:bCs w:val="false"/>
+                <w:sz w:val="19"/>
+                <w:szCs w:val="19"/>
+              </w:rPr>
+              <w:t xml:space="preserve">Có, nhỏ</w:t>
+            </w:r>
+          </w:p>
+        </w:tc>
+      </w:tr>
+    </w:tbl>
+    <w:p>
+      <w:pPr>
+        <w:pStyle w:val="Heading2"/>
+        <w:spacing w:after="120" w:before="280"/>
+      </w:pPr>
+      <w:r>
+        <w:t xml:space="preserve">5.15 Ablation thành phần đặc trưng</w:t>
+      </w:r>
+    </w:p>
+    <w:p>
+      <w:pPr>
+        <w:spacing w:after="160" w:line="300"/>
+        <w:jc w:val="both"/>
+      </w:pPr>
+      <w:r>
+        <w:rPr>
+          <w:b w:val="false"/>
+          <w:bCs w:val="false"/>
+          <w:i w:val="false"/>
+          <w:iCs w:val="false"/>
+        </w:rPr>
+        <w:t xml:space="preserve">Ablation trên cùng locked test block tách bốn cấu hình: chỉ lag cases (base), seen-lag indicators, missing-run length và full mask. Ở reporting-aware mode, missing-run đạt MAE thấp nhất tại horizon 1 (44,21), còn full mask đạt kết quả tốt hơn base tại horizon 2 (45,18 so với 45,55) và horizon 4 (47,71 so với 47,93). Không có một thành phần đơn lẻ thắng ở mọi horizon, nhưng các chỉ báo quan sát giúp cải thiện có điều kiện và giải thích được vì sao mask không chỉ là metadata dư thừa.</w:t>
+      </w:r>
+    </w:p>
+    <w:tbl>
+      <w:tblPr>
+        <w:tblW w:type="dxa" w:w="10800"/>
+        <w:tblBorders>
+          <w:top w:val="single" w:color="auto" w:sz="4"/>
+          <w:left w:val="single" w:color="auto" w:sz="4"/>
+          <w:bottom w:val="single" w:color="auto" w:sz="4"/>
+          <w:right w:val="single" w:color="auto" w:sz="4"/>
+          <w:insideH w:val="single" w:color="auto" w:sz="4"/>
+          <w:insideV w:val="single" w:color="auto" w:sz="4"/>
+        </w:tblBorders>
+      </w:tblPr>
+      <w:tblGrid>
+        <w:gridCol w:w="4200"/>
+        <w:gridCol w:w="2200"/>
+        <w:gridCol w:w="2200"/>
+        <w:gridCol w:w="2200"/>
+      </w:tblGrid>
+      <w:tr>
+        <w:trPr>
+          <w:tblHeader/>
+        </w:trPr>
+        <w:tc>
+          <w:tcPr>
+            <w:tcW w:type="dxa" w:w="4200"/>
+            <w:shd w:fill="E8EEF7" w:color="auto" w:val="clear"/>
+          </w:tcPr>
+          <w:p>
+            <w:r>
+              <w:rPr>
+                <w:b/>
+                <w:bCs/>
+                <w:sz w:val="19"/>
+                <w:szCs w:val="19"/>
+              </w:rPr>
+              <w:t xml:space="preserve">Feature set</w:t>
+            </w:r>
+          </w:p>
+        </w:tc>
+        <w:tc>
+          <w:tcPr>
+            <w:tcW w:type="dxa" w:w="2200"/>
+            <w:shd w:fill="E8EEF7" w:color="auto" w:val="clear"/>
+          </w:tcPr>
+          <w:p>
+            <w:r>
+              <w:rPr>
+                <w:b/>
+                <w:bCs/>
+                <w:sz w:val="19"/>
+                <w:szCs w:val="19"/>
+              </w:rPr>
+              <w:t xml:space="preserve">h = 1 aware</w:t>
+            </w:r>
+          </w:p>
+        </w:tc>
+        <w:tc>
+          <w:tcPr>
+            <w:tcW w:type="dxa" w:w="2200"/>
+            <w:shd w:fill="E8EEF7" w:color="auto" w:val="clear"/>
+          </w:tcPr>
+          <w:p>
+            <w:r>
+              <w:rPr>
+                <w:b/>
+                <w:bCs/>
+                <w:sz w:val="19"/>
+                <w:szCs w:val="19"/>
+              </w:rPr>
+              <w:t xml:space="preserve">h = 2 aware</w:t>
+            </w:r>
+          </w:p>
+        </w:tc>
+        <w:tc>
+          <w:tcPr>
+            <w:tcW w:type="dxa" w:w="2200"/>
+            <w:shd w:fill="E8EEF7" w:color="auto" w:val="clear"/>
+          </w:tcPr>
+          <w:p>
+            <w:r>
+              <w:rPr>
+                <w:b/>
+                <w:bCs/>
+                <w:sz w:val="19"/>
+                <w:szCs w:val="19"/>
+              </w:rPr>
+              <w:t xml:space="preserve">h = 4 aware</w:t>
+            </w:r>
+          </w:p>
+        </w:tc>
+      </w:tr>
+      <w:tr>
+        <w:tc>
+          <w:tcPr>
+            <w:tcW w:type="dxa" w:w="4200"/>
+          </w:tcPr>
+          <w:p>
+            <w:pPr>
+              <w:jc w:val="left"/>
+            </w:pPr>
+            <w:r>
+              <w:rPr>
+                <w:b w:val="false"/>
+                <w:bCs w:val="false"/>
+                <w:sz w:val="19"/>
+                <w:szCs w:val="19"/>
+              </w:rPr>
+              <w:t xml:space="preserve">Base lags</w:t>
+            </w:r>
+          </w:p>
+        </w:tc>
+        <w:tc>
+          <w:tcPr>
+            <w:tcW w:type="dxa" w:w="2200"/>
+          </w:tcPr>
+          <w:p>
+            <w:pPr>
+              <w:jc w:val="right"/>
+            </w:pPr>
+            <w:r>
+              <w:rPr>
+                <w:b w:val="false"/>
+                <w:bCs w:val="false"/>
+                <w:sz w:val="19"/>
+                <w:szCs w:val="19"/>
+              </w:rPr>
+              <w:t xml:space="preserve">44,36</w:t>
+            </w:r>
+          </w:p>
+        </w:tc>
+        <w:tc>
+          <w:tcPr>
+            <w:tcW w:type="dxa" w:w="2200"/>
+          </w:tcPr>
+          <w:p>
+            <w:pPr>
+              <w:jc w:val="right"/>
+            </w:pPr>
+            <w:r>
+              <w:rPr>
+                <w:b w:val="false"/>
+                <w:bCs w:val="false"/>
+                <w:sz w:val="19"/>
+                <w:szCs w:val="19"/>
+              </w:rPr>
+              <w:t xml:space="preserve">45,55</w:t>
+            </w:r>
+          </w:p>
+        </w:tc>
+        <w:tc>
+          <w:tcPr>
+            <w:tcW w:type="dxa" w:w="2200"/>
+          </w:tcPr>
+          <w:p>
+            <w:pPr>
+              <w:jc w:val="right"/>
+            </w:pPr>
+            <w:r>
+              <w:rPr>
+                <w:b w:val="false"/>
+                <w:bCs w:val="false"/>
+                <w:sz w:val="19"/>
+                <w:szCs w:val="19"/>
+              </w:rPr>
+              <w:t xml:space="preserve">47,93</w:t>
+            </w:r>
+          </w:p>
+        </w:tc>
+      </w:tr>
+      <w:tr>
+        <w:tc>
+          <w:tcPr>
+            <w:tcW w:type="dxa" w:w="4200"/>
+          </w:tcPr>
+          <w:p>
+            <w:pPr>
+              <w:jc w:val="left"/>
+            </w:pPr>
+            <w:r>
+              <w:rPr>
+                <w:b w:val="false"/>
+                <w:bCs w:val="false"/>
+                <w:sz w:val="19"/>
+                <w:szCs w:val="19"/>
+              </w:rPr>
+              <w:t xml:space="preserve">Seen-lag indicators</w:t>
+            </w:r>
+          </w:p>
+        </w:tc>
+        <w:tc>
+          <w:tcPr>
+            <w:tcW w:type="dxa" w:w="2200"/>
+          </w:tcPr>
+          <w:p>
+            <w:pPr>
+              <w:jc w:val="right"/>
+            </w:pPr>
+            <w:r>
+              <w:rPr>
+                <w:b w:val="false"/>
+                <w:bCs w:val="false"/>
+                <w:sz w:val="19"/>
+                <w:szCs w:val="19"/>
+              </w:rPr>
+              <w:t xml:space="preserve">44,32</w:t>
+            </w:r>
+          </w:p>
+        </w:tc>
+        <w:tc>
+          <w:tcPr>
+            <w:tcW w:type="dxa" w:w="2200"/>
+          </w:tcPr>
+          <w:p>
+            <w:pPr>
+              <w:jc w:val="right"/>
+            </w:pPr>
+            <w:r>
+              <w:rPr>
+                <w:b w:val="false"/>
+                <w:bCs w:val="false"/>
+                <w:sz w:val="19"/>
+                <w:szCs w:val="19"/>
+              </w:rPr>
+              <w:t xml:space="preserve">45,46</w:t>
+            </w:r>
+          </w:p>
+        </w:tc>
+        <w:tc>
+          <w:tcPr>
+            <w:tcW w:type="dxa" w:w="2200"/>
+          </w:tcPr>
+          <w:p>
+            <w:pPr>
+              <w:jc w:val="right"/>
+            </w:pPr>
+            <w:r>
+              <w:rPr>
+                <w:b w:val="false"/>
+                <w:bCs w:val="false"/>
+                <w:sz w:val="19"/>
+                <w:szCs w:val="19"/>
+              </w:rPr>
+              <w:t xml:space="preserve">47,86</w:t>
+            </w:r>
+          </w:p>
+        </w:tc>
+      </w:tr>
+      <w:tr>
+        <w:tc>
+          <w:tcPr>
+            <w:tcW w:type="dxa" w:w="4200"/>
+          </w:tcPr>
+          <w:p>
+            <w:pPr>
+              <w:jc w:val="left"/>
+            </w:pPr>
+            <w:r>
+              <w:rPr>
+                <w:b w:val="false"/>
+                <w:bCs w:val="false"/>
+                <w:sz w:val="19"/>
+                <w:szCs w:val="19"/>
+              </w:rPr>
+              <w:t xml:space="preserve">Missing-run length</w:t>
+            </w:r>
+          </w:p>
+        </w:tc>
+        <w:tc>
+          <w:tcPr>
+            <w:tcW w:type="dxa" w:w="2200"/>
+          </w:tcPr>
+          <w:p>
+            <w:pPr>
+              <w:jc w:val="right"/>
+            </w:pPr>
+            <w:r>
+              <w:rPr>
+                <w:b w:val="false"/>
+                <w:bCs w:val="false"/>
+                <w:sz w:val="19"/>
+                <w:szCs w:val="19"/>
+              </w:rPr>
+              <w:t xml:space="preserve">44,21</w:t>
+            </w:r>
+          </w:p>
+        </w:tc>
+        <w:tc>
+          <w:tcPr>
+            <w:tcW w:type="dxa" w:w="2200"/>
+          </w:tcPr>
+          <w:p>
+            <w:pPr>
+              <w:jc w:val="right"/>
+            </w:pPr>
+            <w:r>
+              <w:rPr>
+                <w:b w:val="false"/>
+                <w:bCs w:val="false"/>
+                <w:sz w:val="19"/>
+                <w:szCs w:val="19"/>
+              </w:rPr>
+              <w:t xml:space="preserve">45,29</w:t>
+            </w:r>
+          </w:p>
+        </w:tc>
+        <w:tc>
+          <w:tcPr>
+            <w:tcW w:type="dxa" w:w="2200"/>
+          </w:tcPr>
+          <w:p>
+            <w:pPr>
+              <w:jc w:val="right"/>
+            </w:pPr>
+            <w:r>
+              <w:rPr>
+                <w:b w:val="false"/>
+                <w:bCs w:val="false"/>
+                <w:sz w:val="19"/>
+                <w:szCs w:val="19"/>
+              </w:rPr>
+              <w:t xml:space="preserve">47,84</w:t>
+            </w:r>
+          </w:p>
+        </w:tc>
+      </w:tr>
+      <w:tr>
+        <w:tc>
+          <w:tcPr>
+            <w:tcW w:type="dxa" w:w="4200"/>
+          </w:tcPr>
+          <w:p>
+            <w:pPr>
+              <w:jc w:val="left"/>
+            </w:pPr>
+            <w:r>
+              <w:rPr>
+                <w:b w:val="false"/>
+                <w:bCs w:val="false"/>
+                <w:sz w:val="19"/>
+                <w:szCs w:val="19"/>
+              </w:rPr>
+              <w:t xml:space="preserve">Full observation mask</w:t>
+            </w:r>
+          </w:p>
+        </w:tc>
+        <w:tc>
+          <w:tcPr>
+            <w:tcW w:type="dxa" w:w="2200"/>
+          </w:tcPr>
+          <w:p>
+            <w:pPr>
+              <w:jc w:val="right"/>
+            </w:pPr>
+            <w:r>
+              <w:rPr>
+                <w:b w:val="false"/>
+                <w:bCs w:val="false"/>
+                <w:sz w:val="19"/>
+                <w:szCs w:val="19"/>
+              </w:rPr>
+              <w:t xml:space="preserve">44,33</w:t>
+            </w:r>
+          </w:p>
+        </w:tc>
+        <w:tc>
+          <w:tcPr>
+            <w:tcW w:type="dxa" w:w="2200"/>
+          </w:tcPr>
+          <w:p>
+            <w:pPr>
+              <w:jc w:val="right"/>
+            </w:pPr>
+            <w:r>
+              <w:rPr>
+                <w:b w:val="false"/>
+                <w:bCs w:val="false"/>
+                <w:sz w:val="19"/>
+                <w:szCs w:val="19"/>
+              </w:rPr>
+              <w:t xml:space="preserve">45,18</w:t>
+            </w:r>
+          </w:p>
+        </w:tc>
+        <w:tc>
+          <w:tcPr>
+            <w:tcW w:type="dxa" w:w="2200"/>
+          </w:tcPr>
+          <w:p>
+            <w:pPr>
+              <w:jc w:val="right"/>
+            </w:pPr>
+            <w:r>
+              <w:rPr>
+                <w:b w:val="false"/>
+                <w:bCs w:val="false"/>
+                <w:sz w:val="19"/>
+                <w:szCs w:val="19"/>
+              </w:rPr>
+              <w:t xml:space="preserve">47,71</w:t>
+            </w:r>
+          </w:p>
+        </w:tc>
+      </w:tr>
+    </w:tbl>
+    <w:p>
+      <w:pPr>
+        <w:pStyle w:val="Heading2"/>
+        <w:spacing w:after="120" w:before="280"/>
+      </w:pPr>
+      <w:r>
+        <w:t xml:space="preserve">5.16 Hiệu năng hệ thống</w:t>
       </w:r>
     </w:p>
     <w:tbl>

</xml_diff>